<commit_message>
Resume: IT Control Testing Specialist @ Deloitte (MNC)
</commit_message>
<xml_diff>
--- a/resumes/Resume_IT_Control_Testing_Specialist_Deloitte__MNC_.docx
+++ b/resumes/Resume_IT_Control_Testing_Specialist_Deloitte__MNC_.docx
@@ -412,7 +412,7 @@
           <w:sz w:val="19"/>
           <w:szCs w:val="19"/>
         </w:rPr>
-        <w:t>Triaged 50+ weekly inventory reimbursement cases by severity and policy eligibility, mirroring the structured alert triage and escalation workflow used in IT Control Testing Specialist roles.</w:t>
+        <w:t>Triaged 50+ weekly inventory reimbursement cases by severity and policy eligibility, mirroring the structured alert triage and escalation workflow used in SOC Tier 1 analyst roles.</w:t>
       </w:r>
       <w:proofErr w:type="spellStart"/>
       <w:r>
@@ -449,7 +449,7 @@
           <w:sz w:val="19"/>
           <w:szCs w:val="19"/>
         </w:rPr>
-        <w:t>Performed root cause analysis on seller claims to identify policy violations and anomalous patterns; escalated findings to senior reviewers, demonstrating investigative instincts central to regulatory compliance and IT controls.</w:t>
+        <w:t>Performed root cause analysis on seller claims to identify policy violations and anomalous patterns; escalated findings to senior reviewers, demonstrating investigative instincts central to SOC and fraud analyst operations.</w:t>
       </w:r>
     </w:p>
     <w:p>
@@ -468,7 +468,7 @@
           <w:sz w:val="19"/>
           <w:szCs w:val="19"/>
         </w:rPr>
-        <w:t>Maintained audit-ready case documentation recording investigation findings, decisions, and corrective actions, establishing the evidence chain-of-custody discipline required for operational effectiveness and IT audit.</w:t>
+        <w:t>Maintained audit-ready case documentation recording investigation findings, decisions, and corrective actions, establishing the evidence chain-of-custody discipline required for security incident reporting and IT audit.</w:t>
       </w:r>
     </w:p>
     <w:p>
@@ -525,7 +525,7 @@
             <w:color w:val="000000"/>
             <w:u w:val="single"/>
           </w:rPr>
-          <w:t>SOC Automation and Threat Detection Lab</w:t>
+          <w:t>IT Control Testing Specialist</w:t>
         </w:r>
       </w:hyperlink>
       <w:r>
@@ -562,7 +562,7 @@
           <w:sz w:val="19"/>
           <w:szCs w:val="19"/>
         </w:rPr>
-        <w:t>Deployed Splunk SIEM with spl correlation (detection engineering) searches for brute-force detection (index=* failed | stats count by src_ip), lateral movement, and privilege escalation; mapped TTPs to mitre att&amp;ck (TTP mapping) (T1110, T1078, T1059) and wrote PICERL incident report.</w:t>
+        <w:t>Designed and implemented Splunk SIEM with SPL correlation (detection engineering) searches for brute-force detection (index=* failed | stats count by src_ip), lateral movement, and privilege escalation; mapped TTPs to MITRE ATT&amp;CK (TTP mapping) (T1110, T1078, T1059) and wrote incident report.</w:t>
       </w:r>
     </w:p>
     <w:p>
@@ -581,7 +581,7 @@
           <w:sz w:val="19"/>
           <w:szCs w:val="19"/>
         </w:rPr>
-        <w:t>Built automated soar (security orchestration and automation)-style detection pipeline: Python script ingests Splunk alerts, runs ioc enrichment (threat intelligence) via VirusTotal API, and dispatches Telegram notifications with severity classification — reducing mean time to triage by automating repetitive tasks and improving operational effectiveness.</w:t>
+        <w:t>Built automated SOAR (security orchestration and automation)-style detection pipeline: Python script ingests Splunk alerts, runs IOC enrichment (threat intelligence) via VirusTotal API, and dispatches Telegram notifications with severity classification — reducing mean time to triage by automating repetitive tasks.</w:t>
       </w:r>
     </w:p>
     <w:p>
@@ -600,7 +600,7 @@
           <w:sz w:val="19"/>
           <w:szCs w:val="19"/>
         </w:rPr>
-        <w:t>Converted detection logic to sigma rules (detection-as-code) (vendor-neutral format used by enterprise SOCs); performed TCP/IP analysis in Wireshark to detect SYN scans, DNS tunnelling, and plaintext credential exposure on unencrypted sessions.</w:t>
+        <w:t>Converted detection logic to Sigma rules (detection-as-code) (vendor-neutral format used by enterprise SOCs); performed TCP/IP analysis in Wireshark to detect SYN scans, DNS tunnelling, and plaintext credential exposure on unencrypted sessions.</w:t>
       </w:r>
       <w:proofErr w:type="spellStart"/>
       <w:r>
@@ -661,7 +661,7 @@
             <w:color w:val="000000"/>
             <w:u w:val="single"/>
           </w:rPr>
-          <w:t>Vulnerability Scanner and Patch Prioritization Engine</w:t>
+          <w:t>IT Control Testing Specialist</w:t>
         </w:r>
       </w:hyperlink>
       <w:r>
@@ -698,7 +698,7 @@
           <w:sz w:val="19"/>
           <w:szCs w:val="19"/>
         </w:rPr>
-        <w:t>Built automated vulnerability assessment pipeline integrating Nessus and OpenVAS REST APIs in Python; generates CVE reports classified by cvss severity (vulnerability prioritisation); implemented epss scoring (exploit probability scoring) from FIRST.org API to prioritise by actual exploit probability — a metric rarely used in IT Control Testing Specialist roles.</w:t>
+        <w:t>Built automated vulnerability assessment pipeline integrating Nessus and OpenVAS REST APIs in Python; generates CVE reports classified by CVSS severity (vulnerability prioritisation); implemented EPSS scoring (exploit probability scoring) from FIRST.org API to prioritise by actual exploit probability.</w:t>
       </w:r>
     </w:p>
     <w:p>
@@ -717,7 +717,7 @@
           <w:sz w:val="19"/>
           <w:szCs w:val="19"/>
         </w:rPr>
-        <w:t>Developed owasp top 10 (web application security) automated web checker that sends crafted HTTP requests to detect injection, broken auth, and SSRF vulnerabilities; documented SQL injection exploit and parameterised query remediation.</w:t>
+        <w:t>Developed OWASP Top 10 (web application security) automated web checker that sends crafted HTTP requests to detect injection, broken auth, and SSRF vulnerabilities; documented SQL injection exploit and parameterised query remediation.</w:t>
       </w:r>
     </w:p>
     <w:p>
@@ -736,7 +736,7 @@
           <w:sz w:val="19"/>
           <w:szCs w:val="19"/>
         </w:rPr>
-        <w:t>Automated scan scheduling via Bash and cron; built delta-scan logic to flag newly discovered CVEs and calculate remediation SLA deadlines (Critical=24hrs, High=7 days, Medium=30 days) for patch compliance (remediation tracking) tracking and IT controls.</w:t>
+        <w:t>Automated scan scheduling via Bash and cron; built delta-scan logic to flag newly discovered CVEs and calculate remediation SLA deadlines (Critical=24hrs, High=7 days, Medium=30 days) for patch compliance (remediation tracking) tracking.</w:t>
       </w:r>
     </w:p>
     <w:p>
@@ -881,7 +881,7 @@
           <w:sz w:val="19"/>
           <w:szCs w:val="19"/>
         </w:rPr>
-        <w:t>Python, Bash (basic), regular expressions, compliance, controls, control</w:t>
+        <w:t>Python, Bash (basic), regular expressions, compliance, controls, security</w:t>
       </w:r>
     </w:p>
     <w:p>

</xml_diff>